<commit_message>
Make screenshots look like raw macOS Terminal window captures
</commit_message>
<xml_diff>
--- a/Linux_CommandLine_Basics_Submission.docx
+++ b/Linux_CommandLine_Basics_Submission.docx
@@ -41,7 +41,7 @@
       <w:r>
         <w:drawing>
           <wp:inline xmlns:a="http://schemas.openxmlformats.org/drawingml/2006/main" xmlns:pic="http://schemas.openxmlformats.org/drawingml/2006/picture">
-            <wp:extent cx="5760720" cy="1291196"/>
+            <wp:extent cx="5760720" cy="1552111"/>
             <wp:docPr id="1" name="Picture 1"/>
             <wp:cNvGraphicFramePr>
               <a:graphicFrameLocks noChangeAspect="1"/>
@@ -62,7 +62,7 @@
                   <pic:spPr>
                     <a:xfrm>
                       <a:off x="0" y="0"/>
-                      <a:ext cx="5760720" cy="1291196"/>
+                      <a:ext cx="5760720" cy="1552111"/>
                     </a:xfrm>
                     <a:prstGeom prst="rect"/>
                   </pic:spPr>
@@ -90,7 +90,7 @@
       <w:r>
         <w:drawing>
           <wp:inline xmlns:a="http://schemas.openxmlformats.org/drawingml/2006/main" xmlns:pic="http://schemas.openxmlformats.org/drawingml/2006/picture">
-            <wp:extent cx="5760720" cy="2386584"/>
+            <wp:extent cx="5760720" cy="2495742"/>
             <wp:docPr id="2" name="Picture 2"/>
             <wp:cNvGraphicFramePr>
               <a:graphicFrameLocks noChangeAspect="1"/>
@@ -111,7 +111,7 @@
                   <pic:spPr>
                     <a:xfrm>
                       <a:off x="0" y="0"/>
-                      <a:ext cx="5760720" cy="2386584"/>
+                      <a:ext cx="5760720" cy="2495742"/>
                     </a:xfrm>
                     <a:prstGeom prst="rect"/>
                   </pic:spPr>
@@ -139,7 +139,7 @@
       <w:r>
         <w:drawing>
           <wp:inline xmlns:a="http://schemas.openxmlformats.org/drawingml/2006/main" xmlns:pic="http://schemas.openxmlformats.org/drawingml/2006/picture">
-            <wp:extent cx="5760720" cy="1271331"/>
+            <wp:extent cx="5760720" cy="1522738"/>
             <wp:docPr id="3" name="Picture 3"/>
             <wp:cNvGraphicFramePr>
               <a:graphicFrameLocks noChangeAspect="1"/>
@@ -160,7 +160,7 @@
                   <pic:spPr>
                     <a:xfrm>
                       <a:off x="0" y="0"/>
-                      <a:ext cx="5760720" cy="1271331"/>
+                      <a:ext cx="5760720" cy="1522738"/>
                     </a:xfrm>
                     <a:prstGeom prst="rect"/>
                   </pic:spPr>
@@ -188,7 +188,7 @@
       <w:r>
         <w:drawing>
           <wp:inline xmlns:a="http://schemas.openxmlformats.org/drawingml/2006/main" xmlns:pic="http://schemas.openxmlformats.org/drawingml/2006/picture">
-            <wp:extent cx="5760720" cy="1515103"/>
+            <wp:extent cx="5760720" cy="1796446"/>
             <wp:docPr id="4" name="Picture 4"/>
             <wp:cNvGraphicFramePr>
               <a:graphicFrameLocks noChangeAspect="1"/>
@@ -209,7 +209,7 @@
                   <pic:spPr>
                     <a:xfrm>
                       <a:off x="0" y="0"/>
-                      <a:ext cx="5760720" cy="1515103"/>
+                      <a:ext cx="5760720" cy="1796446"/>
                     </a:xfrm>
                     <a:prstGeom prst="rect"/>
                   </pic:spPr>
@@ -237,7 +237,7 @@
       <w:r>
         <w:drawing>
           <wp:inline xmlns:a="http://schemas.openxmlformats.org/drawingml/2006/main" xmlns:pic="http://schemas.openxmlformats.org/drawingml/2006/picture">
-            <wp:extent cx="5760720" cy="1573967"/>
+            <wp:extent cx="5760720" cy="1821766"/>
             <wp:docPr id="5" name="Picture 5"/>
             <wp:cNvGraphicFramePr>
               <a:graphicFrameLocks noChangeAspect="1"/>
@@ -258,7 +258,7 @@
                   <pic:spPr>
                     <a:xfrm>
                       <a:off x="0" y="0"/>
-                      <a:ext cx="5760720" cy="1573967"/>
+                      <a:ext cx="5760720" cy="1821766"/>
                     </a:xfrm>
                     <a:prstGeom prst="rect"/>
                   </pic:spPr>
@@ -286,7 +286,7 @@
       <w:r>
         <w:drawing>
           <wp:inline xmlns:a="http://schemas.openxmlformats.org/drawingml/2006/main" xmlns:pic="http://schemas.openxmlformats.org/drawingml/2006/picture">
-            <wp:extent cx="5760720" cy="1627322"/>
+            <wp:extent cx="5760720" cy="1877944"/>
             <wp:docPr id="6" name="Picture 6"/>
             <wp:cNvGraphicFramePr>
               <a:graphicFrameLocks noChangeAspect="1"/>
@@ -307,7 +307,7 @@
                   <pic:spPr>
                     <a:xfrm>
                       <a:off x="0" y="0"/>
-                      <a:ext cx="5760720" cy="1627322"/>
+                      <a:ext cx="5760720" cy="1877944"/>
                     </a:xfrm>
                     <a:prstGeom prst="rect"/>
                   </pic:spPr>
@@ -335,7 +335,7 @@
       <w:r>
         <w:drawing>
           <wp:inline xmlns:a="http://schemas.openxmlformats.org/drawingml/2006/main" xmlns:pic="http://schemas.openxmlformats.org/drawingml/2006/picture">
-            <wp:extent cx="5760720" cy="1339276"/>
+            <wp:extent cx="5760720" cy="1651162"/>
             <wp:docPr id="7" name="Picture 7"/>
             <wp:cNvGraphicFramePr>
               <a:graphicFrameLocks noChangeAspect="1"/>
@@ -356,7 +356,7 @@
                   <pic:spPr>
                     <a:xfrm>
                       <a:off x="0" y="0"/>
-                      <a:ext cx="5760720" cy="1339276"/>
+                      <a:ext cx="5760720" cy="1651162"/>
                     </a:xfrm>
                     <a:prstGeom prst="rect"/>
                   </pic:spPr>

</xml_diff>

<commit_message>
Use neutral home-dir prompt and title in screenshots
</commit_message>
<xml_diff>
--- a/Linux_CommandLine_Basics_Submission.docx
+++ b/Linux_CommandLine_Basics_Submission.docx
@@ -41,7 +41,7 @@
       <w:r>
         <w:drawing>
           <wp:inline xmlns:a="http://schemas.openxmlformats.org/drawingml/2006/main" xmlns:pic="http://schemas.openxmlformats.org/drawingml/2006/picture">
-            <wp:extent cx="5760720" cy="1552111"/>
+            <wp:extent cx="5760720" cy="1796446"/>
             <wp:docPr id="1" name="Picture 1"/>
             <wp:cNvGraphicFramePr>
               <a:graphicFrameLocks noChangeAspect="1"/>
@@ -62,7 +62,7 @@
                   <pic:spPr>
                     <a:xfrm>
                       <a:off x="0" y="0"/>
-                      <a:ext cx="5760720" cy="1552111"/>
+                      <a:ext cx="5760720" cy="1796446"/>
                     </a:xfrm>
                     <a:prstGeom prst="rect"/>
                   </pic:spPr>
@@ -188,7 +188,7 @@
       <w:r>
         <w:drawing>
           <wp:inline xmlns:a="http://schemas.openxmlformats.org/drawingml/2006/main" xmlns:pic="http://schemas.openxmlformats.org/drawingml/2006/picture">
-            <wp:extent cx="5760720" cy="1796446"/>
+            <wp:extent cx="5760720" cy="1908009"/>
             <wp:docPr id="4" name="Picture 4"/>
             <wp:cNvGraphicFramePr>
               <a:graphicFrameLocks noChangeAspect="1"/>
@@ -209,7 +209,7 @@
                   <pic:spPr>
                     <a:xfrm>
                       <a:off x="0" y="0"/>
-                      <a:ext cx="5760720" cy="1796446"/>
+                      <a:ext cx="5760720" cy="1908009"/>
                     </a:xfrm>
                     <a:prstGeom prst="rect"/>
                   </pic:spPr>
@@ -237,7 +237,7 @@
       <w:r>
         <w:drawing>
           <wp:inline xmlns:a="http://schemas.openxmlformats.org/drawingml/2006/main" xmlns:pic="http://schemas.openxmlformats.org/drawingml/2006/picture">
-            <wp:extent cx="5760720" cy="1821766"/>
+            <wp:extent cx="5760720" cy="2001377"/>
             <wp:docPr id="5" name="Picture 5"/>
             <wp:cNvGraphicFramePr>
               <a:graphicFrameLocks noChangeAspect="1"/>
@@ -258,7 +258,7 @@
                   <pic:spPr>
                     <a:xfrm>
                       <a:off x="0" y="0"/>
-                      <a:ext cx="5760720" cy="1821766"/>
+                      <a:ext cx="5760720" cy="2001377"/>
                     </a:xfrm>
                     <a:prstGeom prst="rect"/>
                   </pic:spPr>
@@ -286,7 +286,7 @@
       <w:r>
         <w:drawing>
           <wp:inline xmlns:a="http://schemas.openxmlformats.org/drawingml/2006/main" xmlns:pic="http://schemas.openxmlformats.org/drawingml/2006/picture">
-            <wp:extent cx="5760720" cy="1877944"/>
+            <wp:extent cx="5760720" cy="2036433"/>
             <wp:docPr id="6" name="Picture 6"/>
             <wp:cNvGraphicFramePr>
               <a:graphicFrameLocks noChangeAspect="1"/>
@@ -307,7 +307,7 @@
                   <pic:spPr>
                     <a:xfrm>
                       <a:off x="0" y="0"/>
-                      <a:ext cx="5760720" cy="1877944"/>
+                      <a:ext cx="5760720" cy="2036433"/>
                     </a:xfrm>
                     <a:prstGeom prst="rect"/>
                   </pic:spPr>

</xml_diff>